<commit_message>
Thesis Chapter 2: Table 2.1 now carries the six quality questions QA1-QA6 of the slides
Co-Authored-By: Claude Fable 5.1 <noreply@anthropic.com>
Claude-Session: https://claude.ai/code/session_01QHSSv245Aernyaebt7V5kS
</commit_message>
<xml_diff>
--- a/docs/Yasir_Thesis_Chapters_1-3.docx
+++ b/docs/Yasir_Thesis_Chapters_1-3.docx
@@ -5723,7 +5723,13 @@
         <w:jc w:val="both"/>
       </w:pPr>
       <w:r>
-        <w:t>The included studies were systematically analysed using a predefined data extraction framework. Each study was coded as Yes, Partial, or No against seven trust dimensions, T1 (identity), T2 (authority), T3 (multi-party), T4 (policy), T5 (temporal), T6 (lifecycle), and T7 (audit), and against the requirements, with a page reference for every positive coding. A study passed when its score on QA1 to QA4 of the eight quality items was at least 3.0. Table 2.1 shows the quality items, how each one was scored, and the rule used for inclusion. A study is core if its gap-impact verdict is contradicts, weakens, or narrows, or if its T3 coding is Yes or Partial. Of the 25 included studies, S1 to S25, 23 are core studies and 2 are supporting studies (Albalwy, Brass &amp; Davies 2021; Li et al. 2026a). Table 2.2 lists the 25 primary studies with their year, title, and category.</w:t>
+        <w:t xml:space="preserve">The included studies were systematically analysed using a predefined data extraction framework. Each study was coded as Yes, Partial, or No against seven trust dimensions, T1 (identity), T2 (authority), T3 (multi-party), T4 (policy), T5 (temporal), T6 (lifecycle), and T7 (audit), and against the requirements, with a page reference for every positive coding. A study passed when its score on QA1 to QA4 </w:t>
+      </w:r>
+      <w:r>
+        <w:t>of the six quality items</w:t>
+      </w:r>
+      <w:r>
+        <w:t xml:space="preserve"> was at least 3.0. Table 2.1 shows the quality items, how each one was scored, and the rule used for inclusion. A study is core if its gap-impact verdict is contradicts, weakens, or narrows, or if its T3 coding is Yes or Partial. Of the 25 included studies, S1 to S25, 23 are core studies and 2 are supporting studies (Albalwy, Brass &amp; Davies 2021; Li et al. 2026a). Table 2.2 lists the 25 primary studies with their year, title, and category.</w:t>
       </w:r>
     </w:p>
     <w:p>
@@ -5936,7 +5942,7 @@
                 <w:sz w:val="19"/>
                 <w:szCs w:val="20"/>
               </w:rPr>
-              <w:t>QA1</w:t>
+              <w:t xml:space="preserve">QA1</w:t>
             </w:r>
           </w:p>
         </w:tc>
@@ -5974,7 +5980,7 @@
                 <w:sz w:val="19"/>
                 <w:szCs w:val="20"/>
               </w:rPr>
-              <w:t>Does the study deal with patient consent or consent-governed data access at the healthcare level?</w:t>
+              <w:t xml:space="preserve">Does the study define a consent model covering identity, authority, policy, and evidence?</w:t>
             </w:r>
           </w:p>
         </w:tc>
@@ -6012,7 +6018,7 @@
                 <w:sz w:val="19"/>
                 <w:szCs w:val="20"/>
               </w:rPr>
-              <w:t>Inclusion</w:t>
+              <w:t xml:space="preserve">Inclusion</w:t>
             </w:r>
           </w:p>
         </w:tc>
@@ -6055,7 +6061,7 @@
                 <w:sz w:val="19"/>
                 <w:szCs w:val="20"/>
               </w:rPr>
-              <w:t>QA2</w:t>
+              <w:t xml:space="preserve">QA2</w:t>
             </w:r>
           </w:p>
         </w:tc>
@@ -6093,7 +6099,7 @@
                 <w:sz w:val="19"/>
                 <w:szCs w:val="20"/>
               </w:rPr>
-              <w:t>Does it deal with an authorisation or access-decision mechanism, not storage or recording only?</w:t>
+              <w:t xml:space="preserve">Does the study verify participant identities and their authorisation authority?</w:t>
             </w:r>
           </w:p>
         </w:tc>
@@ -6131,7 +6137,7 @@
                 <w:sz w:val="19"/>
                 <w:szCs w:val="20"/>
               </w:rPr>
-              <w:t>Inclusion</w:t>
+              <w:t xml:space="preserve">Inclusion</w:t>
             </w:r>
           </w:p>
         </w:tc>
@@ -6174,7 +6180,7 @@
                 <w:sz w:val="19"/>
                 <w:szCs w:val="20"/>
               </w:rPr>
-              <w:t>QA3</w:t>
+              <w:t xml:space="preserve">QA3</w:t>
             </w:r>
           </w:p>
         </w:tc>
@@ -6212,7 +6218,7 @@
                 <w:sz w:val="19"/>
                 <w:szCs w:val="20"/>
               </w:rPr>
-              <w:t>Does it introduce a proper framework, model, protocol or architecture to address its aim?</w:t>
+              <w:t xml:space="preserve">Does the study support consent decisions requiring approval from multiple authorised participants?</w:t>
             </w:r>
           </w:p>
         </w:tc>
@@ -6250,7 +6256,7 @@
                 <w:sz w:val="19"/>
                 <w:szCs w:val="20"/>
               </w:rPr>
-              <w:t>Inclusion</w:t>
+              <w:t xml:space="preserve">Inclusion</w:t>
             </w:r>
           </w:p>
         </w:tc>
@@ -6293,7 +6299,7 @@
                 <w:sz w:val="19"/>
                 <w:szCs w:val="20"/>
               </w:rPr>
-              <w:t>QA4</w:t>
+              <w:t xml:space="preserve">QA4</w:t>
             </w:r>
           </w:p>
         </w:tc>
@@ -6331,7 +6337,7 @@
                 <w:sz w:val="19"/>
                 <w:szCs w:val="20"/>
               </w:rPr>
-              <w:t>Is the proposed methodology validated by a proof of concept or an implementation?</w:t>
+              <w:t xml:space="preserve">Does the study enforce purpose, data scope, and approval rules before allowing access?</w:t>
             </w:r>
           </w:p>
         </w:tc>
@@ -6369,7 +6375,7 @@
                 <w:sz w:val="19"/>
                 <w:szCs w:val="20"/>
               </w:rPr>
-              <w:t>Inclusion</w:t>
+              <w:t xml:space="preserve">Inclusion</w:t>
             </w:r>
           </w:p>
         </w:tc>
@@ -6412,7 +6418,7 @@
                 <w:sz w:val="19"/>
                 <w:szCs w:val="20"/>
               </w:rPr>
-              <w:t>QA5 to QA8</w:t>
+              <w:t xml:space="preserve">QA5</w:t>
             </w:r>
           </w:p>
         </w:tc>
@@ -6450,7 +6456,7 @@
                 <w:sz w:val="19"/>
                 <w:szCs w:val="20"/>
               </w:rPr>
-              <w:t>Further quality items scored for every included study.</w:t>
+              <w:t xml:space="preserve">Does the study manage consent validity, expiry, and revocation?</w:t>
             </w:r>
           </w:p>
         </w:tc>
@@ -6488,7 +6494,126 @@
                 <w:sz w:val="19"/>
                 <w:szCs w:val="20"/>
               </w:rPr>
-              <w:t>Evidence tier only (A, B, C, Background), not inclusion</w:t>
+              <w:t xml:space="preserve">Evidence tier only (A, B, C, Background), not inclusion</w:t>
+            </w:r>
+          </w:p>
+        </w:tc>
+      </w:tr>
+      <w:tr>
+        <w:trPr>
+          <w:cantSplit/>
+        </w:trPr>
+        <w:tc>
+          <w:tcPr>
+            <w:tcW w:w="1300" w:type="dxa"/>
+            <w:tcBorders>
+              <w:top w:val="nil"/>
+              <w:left w:val="nil"/>
+              <w:bottom w:val="nil"/>
+              <w:right w:val="nil"/>
+              <w:insideH w:val="nil"/>
+              <w:insideV w:val="nil"/>
+            </w:tcBorders>
+            <w:tcMar>
+              <w:top w:w="40" w:type="dxa"/>
+              <w:left w:w="80" w:type="dxa"/>
+              <w:bottom w:w="40" w:type="dxa"/>
+              <w:right w:w="80" w:type="dxa"/>
+            </w:tcMar>
+          </w:tcPr>
+          <w:p>
+            <w:pPr>
+              <w:spacing w:after="40" w:line="240" w:lineRule="auto"/>
+              <w:jc w:val="left"/>
+              <w:rPr>
+                <w:sz w:val="20"/>
+                <w:szCs w:val="20"/>
+              </w:rPr>
+            </w:pPr>
+            <w:r>
+              <w:rPr>
+                <w:rFonts w:ascii="Palatino Linotype" w:hAnsi="Palatino Linotype" w:cs="Palatino Linotype"/>
+                <w:color w:val="000000"/>
+                <w:sz w:val="19"/>
+                <w:szCs w:val="20"/>
+              </w:rPr>
+              <w:t xml:space="preserve">QA6</w:t>
+            </w:r>
+          </w:p>
+        </w:tc>
+        <w:tc>
+          <w:tcPr>
+            <w:tcW w:w="5428" w:type="dxa"/>
+            <w:tcBorders>
+              <w:top w:val="nil"/>
+              <w:left w:val="nil"/>
+              <w:bottom w:val="nil"/>
+              <w:right w:val="nil"/>
+              <w:insideH w:val="nil"/>
+              <w:insideV w:val="nil"/>
+            </w:tcBorders>
+            <w:tcMar>
+              <w:top w:w="40" w:type="dxa"/>
+              <w:left w:w="80" w:type="dxa"/>
+              <w:bottom w:w="40" w:type="dxa"/>
+              <w:right w:w="80" w:type="dxa"/>
+            </w:tcMar>
+          </w:tcPr>
+          <w:p>
+            <w:pPr>
+              <w:spacing w:after="40" w:line="240" w:lineRule="auto"/>
+              <w:jc w:val="left"/>
+              <w:rPr>
+                <w:sz w:val="20"/>
+                <w:szCs w:val="20"/>
+              </w:rPr>
+            </w:pPr>
+            <w:r>
+              <w:rPr>
+                <w:rFonts w:ascii="Palatino Linotype" w:hAnsi="Palatino Linotype" w:cs="Palatino Linotype"/>
+                <w:color w:val="000000"/>
+                <w:sz w:val="19"/>
+                <w:szCs w:val="20"/>
+              </w:rPr>
+              <w:t xml:space="preserve">Does the study validate security and access decisions through formal analysis or implementation testing?</w:t>
+            </w:r>
+          </w:p>
+        </w:tc>
+        <w:tc>
+          <w:tcPr>
+            <w:tcW w:w="2400" w:type="dxa"/>
+            <w:tcBorders>
+              <w:top w:val="nil"/>
+              <w:left w:val="nil"/>
+              <w:bottom w:val="nil"/>
+              <w:right w:val="nil"/>
+              <w:insideH w:val="nil"/>
+              <w:insideV w:val="nil"/>
+            </w:tcBorders>
+            <w:tcMar>
+              <w:top w:w="40" w:type="dxa"/>
+              <w:left w:w="80" w:type="dxa"/>
+              <w:bottom w:w="40" w:type="dxa"/>
+              <w:right w:w="80" w:type="dxa"/>
+            </w:tcMar>
+          </w:tcPr>
+          <w:p>
+            <w:pPr>
+              <w:spacing w:after="40" w:line="240" w:lineRule="auto"/>
+              <w:jc w:val="left"/>
+              <w:rPr>
+                <w:sz w:val="20"/>
+                <w:szCs w:val="20"/>
+              </w:rPr>
+            </w:pPr>
+            <w:r>
+              <w:rPr>
+                <w:rFonts w:ascii="Palatino Linotype" w:hAnsi="Palatino Linotype" w:cs="Palatino Linotype"/>
+                <w:color w:val="000000"/>
+                <w:sz w:val="19"/>
+                <w:szCs w:val="20"/>
+              </w:rPr>
+              <w:t xml:space="preserve">Evidence tier only (A, B, C, Background), not inclusion</w:t>
             </w:r>
           </w:p>
         </w:tc>

</xml_diff>